<commit_message>
improve Ui of Ai weather Assistant
</commit_message>
<xml_diff>
--- a/weatherApp_Doc.docx
+++ b/weatherApp_Doc.docx
@@ -20,15 +20,7 @@
     </w:p>
     <w:p>
       <w:r>
-        <w:t xml:space="preserve">- </w:t>
-      </w:r>
-      <w:proofErr w:type="spellStart"/>
-      <w:r>
-        <w:t>Ollama</w:t>
-      </w:r>
-      <w:proofErr w:type="spellEnd"/>
-      <w:r>
-        <w:t xml:space="preserve"> AI integration</w:t>
+        <w:t>- Ollama AI integration</w:t>
       </w:r>
     </w:p>
     <w:p>
@@ -87,27 +79,13 @@
     </w:p>
     <w:p>
       <w:r>
-        <w:t xml:space="preserve">There are 2 – </w:t>
-      </w:r>
-      <w:proofErr w:type="spellStart"/>
-      <w:r>
-        <w:t>weatherModel</w:t>
-      </w:r>
-      <w:proofErr w:type="spellEnd"/>
-      <w:r>
-        <w:t xml:space="preserve"> , </w:t>
-      </w:r>
-      <w:proofErr w:type="spellStart"/>
-      <w:r>
-        <w:t>chatMessageModel</w:t>
-      </w:r>
-      <w:proofErr w:type="spellEnd"/>
+        <w:t>There are 2 – weatherModel , chatMessageModel</w:t>
+      </w:r>
     </w:p>
     <w:p>
       <w:r>
         <w:t xml:space="preserve">In </w:t>
       </w:r>
-      <w:proofErr w:type="spellStart"/>
       <w:r>
         <w:rPr>
           <w:b/>
@@ -115,29 +93,15 @@
         </w:rPr>
         <w:t>WeatherModel</w:t>
       </w:r>
-      <w:proofErr w:type="spellEnd"/>
       <w:r>
         <w:t xml:space="preserve"> – city</w:t>
       </w:r>
       <w:r>
-        <w:t>(</w:t>
-      </w:r>
-      <w:proofErr w:type="spellStart"/>
-      <w:r>
-        <w:t>Stirng</w:t>
-      </w:r>
-      <w:proofErr w:type="spellEnd"/>
-      <w:r>
-        <w:t>)</w:t>
-      </w:r>
-      <w:r>
-        <w:t xml:space="preserve">, </w:t>
-      </w:r>
-      <w:proofErr w:type="spellStart"/>
-      <w:r>
-        <w:t>Temprature</w:t>
-      </w:r>
-      <w:proofErr w:type="spellEnd"/>
+        <w:t>(Stirng)</w:t>
+      </w:r>
+      <w:r>
+        <w:t>, Temprature</w:t>
+      </w:r>
       <w:r>
         <w:t>(double),</w:t>
       </w:r>
@@ -158,7 +122,6 @@
       <w:r>
         <w:t xml:space="preserve">In </w:t>
       </w:r>
-      <w:proofErr w:type="spellStart"/>
       <w:r>
         <w:rPr>
           <w:b/>
@@ -166,17 +129,8 @@
         </w:rPr>
         <w:t>ChatMessageModel</w:t>
       </w:r>
-      <w:proofErr w:type="spellEnd"/>
-      <w:r>
-        <w:t xml:space="preserve"> – Sender(String?), Message(String?), Time (</w:t>
-      </w:r>
-      <w:proofErr w:type="spellStart"/>
-      <w:r>
-        <w:t>timeonly</w:t>
-      </w:r>
-      <w:proofErr w:type="spellEnd"/>
-      <w:r>
-        <w:t>)</w:t>
+      <w:r>
+        <w:t xml:space="preserve"> – Sender(String?), Message(String?), Time (timeonly)</w:t>
       </w:r>
     </w:p>
     <w:p>
@@ -199,29 +153,14 @@
     </w:p>
     <w:p>
       <w:r>
-        <w:t>There are 2 page - ,</w:t>
-      </w:r>
-      <w:proofErr w:type="spellStart"/>
-      <w:r>
-        <w:t>WeatherView.xaml</w:t>
-      </w:r>
-      <w:proofErr w:type="spellEnd"/>
-      <w:r>
-        <w:t xml:space="preserve"> , </w:t>
-      </w:r>
-      <w:proofErr w:type="spellStart"/>
-      <w:r>
-        <w:t>chatMessage.xaml</w:t>
-      </w:r>
-      <w:proofErr w:type="spellEnd"/>
+        <w:t>There are 2 page - ,WeatherView.xaml , chatMessage.xaml</w:t>
+      </w:r>
     </w:p>
     <w:p/>
     <w:p>
-      <w:proofErr w:type="spellStart"/>
       <w:r>
         <w:t>WorkFlow</w:t>
       </w:r>
-      <w:proofErr w:type="spellEnd"/>
     </w:p>
     <w:p>
       <w:r>
@@ -233,11 +172,9 @@
       <w:pPr>
         <w:ind w:firstLine="720"/>
       </w:pPr>
-      <w:proofErr w:type="spellStart"/>
       <w:r>
         <w:t>weatherView</w:t>
       </w:r>
-      <w:proofErr w:type="spellEnd"/>
     </w:p>
     <w:p>
       <w:r>
@@ -245,8 +182,6 @@
       </w:r>
       <w:r>
         <w:tab/>
-      </w:r>
-      <w:r>
         <w:t xml:space="preserve">Enter city name </w:t>
       </w:r>
     </w:p>
@@ -256,28 +191,14 @@
       </w:r>
       <w:r>
         <w:tab/>
-      </w:r>
-      <w:r>
-        <w:t xml:space="preserve">Click on </w:t>
-      </w:r>
-      <w:proofErr w:type="spellStart"/>
-      <w:r>
-        <w:t>get_weather</w:t>
-      </w:r>
-      <w:proofErr w:type="spellEnd"/>
-      <w:r>
-        <w:t xml:space="preserve"> button</w:t>
+        <w:t>Click on get_weather button</w:t>
       </w:r>
     </w:p>
     <w:p>
       <w:r>
         <w:tab/>
-      </w:r>
-      <w:proofErr w:type="spellStart"/>
-      <w:r>
         <w:t>WeatherViewModel</w:t>
       </w:r>
-      <w:proofErr w:type="spellEnd"/>
     </w:p>
     <w:p>
       <w:pPr>
@@ -291,62 +212,1430 @@
       <w:pPr>
         <w:ind w:firstLine="720"/>
       </w:pPr>
-      <w:proofErr w:type="spellStart"/>
       <w:r>
         <w:t>WeatherApi</w:t>
       </w:r>
-      <w:proofErr w:type="spellEnd"/>
     </w:p>
     <w:p>
       <w:pPr>
         <w:ind w:firstLine="720"/>
       </w:pPr>
-      <w:proofErr w:type="spellStart"/>
       <w:r>
         <w:t>WeatherModel</w:t>
       </w:r>
-      <w:proofErr w:type="spellEnd"/>
     </w:p>
     <w:p>
       <w:pPr>
         <w:ind w:firstLine="720"/>
       </w:pPr>
       <w:r>
-        <w:t>Ai Service (</w:t>
-      </w:r>
-      <w:proofErr w:type="spellStart"/>
-      <w:r>
-        <w:t>ollama</w:t>
-      </w:r>
-      <w:proofErr w:type="spellEnd"/>
-      <w:r>
-        <w:t>)</w:t>
+        <w:t>Ai Service (ollama)</w:t>
       </w:r>
     </w:p>
     <w:p>
       <w:pPr>
         <w:ind w:firstLine="720"/>
       </w:pPr>
-      <w:proofErr w:type="spellStart"/>
       <w:r>
         <w:t>ChatMessage</w:t>
       </w:r>
-      <w:proofErr w:type="spellEnd"/>
     </w:p>
     <w:p>
       <w:pPr>
         <w:ind w:firstLine="720"/>
       </w:pPr>
-      <w:proofErr w:type="spellStart"/>
       <w:r>
         <w:t>ChatVie</w:t>
       </w:r>
       <w:r>
         <w:t>w</w:t>
       </w:r>
-      <w:proofErr w:type="spellEnd"/>
-    </w:p>
-    <w:p/>
+    </w:p>
+    <w:p>
+      <w:pPr>
+        <w:jc w:val="center"/>
+        <w:rPr>
+          <w:b/>
+          <w:bCs/>
+          <w:sz w:val="28"/>
+          <w:szCs w:val="28"/>
+        </w:rPr>
+      </w:pPr>
+      <w:r>
+        <w:rPr>
+          <w:b/>
+          <w:bCs/>
+          <w:sz w:val="28"/>
+          <w:szCs w:val="28"/>
+        </w:rPr>
+        <w:lastRenderedPageBreak/>
+        <w:t>Version4 :-</w:t>
+      </w:r>
+    </w:p>
+    <w:p>
+      <w:pPr>
+        <w:pStyle w:val="ListParagraph"/>
+        <w:numPr>
+          <w:ilvl w:val="0"/>
+          <w:numId w:val="1"/>
+        </w:numPr>
+        <w:rPr>
+          <w:b/>
+          <w:bCs/>
+          <w:sz w:val="28"/>
+          <w:szCs w:val="28"/>
+        </w:rPr>
+      </w:pPr>
+      <w:r>
+        <w:rPr>
+          <w:sz w:val="28"/>
+          <w:szCs w:val="28"/>
+        </w:rPr>
+        <w:t>Professional Chat UI :-</w:t>
+      </w:r>
+    </w:p>
+    <w:p>
+      <w:pPr>
+        <w:pStyle w:val="ListParagraph"/>
+        <w:numPr>
+          <w:ilvl w:val="0"/>
+          <w:numId w:val="1"/>
+        </w:numPr>
+        <w:rPr>
+          <w:b/>
+          <w:bCs/>
+          <w:sz w:val="28"/>
+          <w:szCs w:val="28"/>
+        </w:rPr>
+      </w:pPr>
+      <w:r>
+        <w:rPr>
+          <w:sz w:val="28"/>
+          <w:szCs w:val="28"/>
+        </w:rPr>
+        <w:t>Learn – DataTemplate Styling</w:t>
+      </w:r>
+    </w:p>
+    <w:p>
+      <w:pPr>
+        <w:pStyle w:val="ListParagraph"/>
+        <w:numPr>
+          <w:ilvl w:val="0"/>
+          <w:numId w:val="1"/>
+        </w:numPr>
+        <w:rPr>
+          <w:b/>
+          <w:bCs/>
+          <w:sz w:val="28"/>
+          <w:szCs w:val="28"/>
+        </w:rPr>
+      </w:pPr>
+      <w:r>
+        <w:rPr>
+          <w:sz w:val="28"/>
+          <w:szCs w:val="28"/>
+        </w:rPr>
+        <w:t>Conditional UI</w:t>
+      </w:r>
+    </w:p>
+    <w:p>
+      <w:pPr>
+        <w:pStyle w:val="ListParagraph"/>
+        <w:numPr>
+          <w:ilvl w:val="0"/>
+          <w:numId w:val="1"/>
+        </w:numPr>
+        <w:rPr>
+          <w:b/>
+          <w:bCs/>
+          <w:sz w:val="28"/>
+          <w:szCs w:val="28"/>
+        </w:rPr>
+      </w:pPr>
+      <w:r>
+        <w:rPr>
+          <w:sz w:val="28"/>
+          <w:szCs w:val="28"/>
+        </w:rPr>
+        <w:t>Better WPF layouts</w:t>
+      </w:r>
+    </w:p>
+    <w:p>
+      <w:pPr>
+        <w:pStyle w:val="ListParagraph"/>
+        <w:rPr>
+          <w:b/>
+          <w:bCs/>
+          <w:sz w:val="28"/>
+          <w:szCs w:val="28"/>
+        </w:rPr>
+      </w:pPr>
+      <w:r>
+        <w:rPr>
+          <w:rFonts w:ascii="Segoe UI Emoji" w:hAnsi="Segoe UI Emoji" w:cs="Segoe UI Emoji"/>
+          <w:b/>
+          <w:bCs/>
+          <w:sz w:val="28"/>
+          <w:szCs w:val="28"/>
+        </w:rPr>
+        <w:t>👤</w:t>
+      </w:r>
+      <w:r>
+        <w:rPr>
+          <w:b/>
+          <w:bCs/>
+          <w:sz w:val="28"/>
+          <w:szCs w:val="28"/>
+        </w:rPr>
+        <w:t xml:space="preserve"> User</w:t>
+      </w:r>
+    </w:p>
+    <w:p>
+      <w:pPr>
+        <w:pStyle w:val="ListParagraph"/>
+        <w:rPr>
+          <w:b/>
+          <w:bCs/>
+          <w:sz w:val="28"/>
+          <w:szCs w:val="28"/>
+        </w:rPr>
+      </w:pPr>
+      <w:r>
+        <w:rPr>
+          <w:b/>
+          <w:bCs/>
+          <w:sz w:val="28"/>
+          <w:szCs w:val="28"/>
+        </w:rPr>
+        <w:t>┌──────────────────┐</w:t>
+      </w:r>
+    </w:p>
+    <w:p>
+      <w:pPr>
+        <w:pStyle w:val="ListParagraph"/>
+        <w:rPr>
+          <w:b/>
+          <w:bCs/>
+          <w:sz w:val="28"/>
+          <w:szCs w:val="28"/>
+        </w:rPr>
+      </w:pPr>
+      <w:r>
+        <w:rPr>
+          <w:b/>
+          <w:bCs/>
+          <w:sz w:val="28"/>
+          <w:szCs w:val="28"/>
+        </w:rPr>
+        <w:t>│ Delhi weather    │</w:t>
+      </w:r>
+    </w:p>
+    <w:p>
+      <w:pPr>
+        <w:pStyle w:val="ListParagraph"/>
+        <w:rPr>
+          <w:b/>
+          <w:bCs/>
+          <w:sz w:val="28"/>
+          <w:szCs w:val="28"/>
+        </w:rPr>
+      </w:pPr>
+      <w:r>
+        <w:rPr>
+          <w:b/>
+          <w:bCs/>
+          <w:sz w:val="28"/>
+          <w:szCs w:val="28"/>
+        </w:rPr>
+        <w:t>└──────────────────┘</w:t>
+      </w:r>
+    </w:p>
+    <w:p>
+      <w:pPr>
+        <w:pStyle w:val="ListParagraph"/>
+        <w:rPr>
+          <w:b/>
+          <w:bCs/>
+          <w:sz w:val="28"/>
+          <w:szCs w:val="28"/>
+        </w:rPr>
+      </w:pPr>
+    </w:p>
+    <w:p>
+      <w:pPr>
+        <w:pStyle w:val="ListParagraph"/>
+        <w:rPr>
+          <w:b/>
+          <w:bCs/>
+          <w:sz w:val="28"/>
+          <w:szCs w:val="28"/>
+        </w:rPr>
+      </w:pPr>
+      <w:r>
+        <w:rPr>
+          <w:rFonts w:ascii="Segoe UI Emoji" w:hAnsi="Segoe UI Emoji" w:cs="Segoe UI Emoji"/>
+          <w:b/>
+          <w:bCs/>
+          <w:sz w:val="28"/>
+          <w:szCs w:val="28"/>
+        </w:rPr>
+        <w:t>🤖</w:t>
+      </w:r>
+      <w:r>
+        <w:rPr>
+          <w:b/>
+          <w:bCs/>
+          <w:sz w:val="28"/>
+          <w:szCs w:val="28"/>
+        </w:rPr>
+        <w:t xml:space="preserve"> AI</w:t>
+      </w:r>
+    </w:p>
+    <w:p>
+      <w:pPr>
+        <w:pStyle w:val="ListParagraph"/>
+        <w:rPr>
+          <w:b/>
+          <w:bCs/>
+          <w:sz w:val="28"/>
+          <w:szCs w:val="28"/>
+        </w:rPr>
+      </w:pPr>
+      <w:r>
+        <w:rPr>
+          <w:b/>
+          <w:bCs/>
+          <w:sz w:val="28"/>
+          <w:szCs w:val="28"/>
+        </w:rPr>
+        <w:t>┌──────────────────┐</w:t>
+      </w:r>
+    </w:p>
+    <w:p>
+      <w:pPr>
+        <w:pStyle w:val="ListParagraph"/>
+        <w:rPr>
+          <w:b/>
+          <w:bCs/>
+          <w:sz w:val="28"/>
+          <w:szCs w:val="28"/>
+        </w:rPr>
+      </w:pPr>
+      <w:r>
+        <w:rPr>
+          <w:b/>
+          <w:bCs/>
+          <w:sz w:val="28"/>
+          <w:szCs w:val="28"/>
+        </w:rPr>
+        <w:t>│ Sunny today...   │</w:t>
+      </w:r>
+    </w:p>
+    <w:p>
+      <w:pPr>
+        <w:pStyle w:val="ListParagraph"/>
+        <w:rPr>
+          <w:b/>
+          <w:bCs/>
+          <w:sz w:val="28"/>
+          <w:szCs w:val="28"/>
+        </w:rPr>
+      </w:pPr>
+      <w:r>
+        <w:rPr>
+          <w:b/>
+          <w:bCs/>
+          <w:sz w:val="28"/>
+          <w:szCs w:val="28"/>
+        </w:rPr>
+        <w:t>└──────────────────┘</w:t>
+      </w:r>
+    </w:p>
+    <w:p>
+      <w:pPr>
+        <w:pStyle w:val="ListParagraph"/>
+        <w:rPr>
+          <w:b/>
+          <w:bCs/>
+          <w:sz w:val="28"/>
+          <w:szCs w:val="28"/>
+        </w:rPr>
+      </w:pPr>
+    </w:p>
+    <w:p>
+      <w:pPr>
+        <w:pStyle w:val="ListParagraph"/>
+        <w:numPr>
+          <w:ilvl w:val="3"/>
+          <w:numId w:val="1"/>
+        </w:numPr>
+        <w:rPr>
+          <w:b/>
+          <w:bCs/>
+          <w:sz w:val="28"/>
+          <w:szCs w:val="28"/>
+        </w:rPr>
+      </w:pPr>
+      <w:r>
+        <w:rPr>
+          <w:sz w:val="28"/>
+          <w:szCs w:val="28"/>
+        </w:rPr>
+        <w:t>Version 5 :-</w:t>
+      </w:r>
+    </w:p>
+    <w:p>
+      <w:pPr>
+        <w:pStyle w:val="ListParagraph"/>
+        <w:numPr>
+          <w:ilvl w:val="0"/>
+          <w:numId w:val="1"/>
+        </w:numPr>
+        <w:rPr>
+          <w:b/>
+          <w:bCs/>
+          <w:sz w:val="28"/>
+          <w:szCs w:val="28"/>
+        </w:rPr>
+      </w:pPr>
+      <w:r>
+        <w:rPr>
+          <w:sz w:val="28"/>
+          <w:szCs w:val="28"/>
+        </w:rPr>
+        <w:t>Weather History</w:t>
+      </w:r>
+    </w:p>
+    <w:p>
+      <w:pPr>
+        <w:pStyle w:val="ListParagraph"/>
+        <w:numPr>
+          <w:ilvl w:val="0"/>
+          <w:numId w:val="1"/>
+        </w:numPr>
+        <w:rPr>
+          <w:b/>
+          <w:bCs/>
+          <w:sz w:val="28"/>
+          <w:szCs w:val="28"/>
+        </w:rPr>
+      </w:pPr>
+      <w:r>
+        <w:rPr>
+          <w:sz w:val="28"/>
+          <w:szCs w:val="28"/>
+        </w:rPr>
+        <w:t xml:space="preserve">Learn </w:t>
+      </w:r>
+    </w:p>
+    <w:p>
+      <w:pPr>
+        <w:pStyle w:val="ListParagraph"/>
+        <w:numPr>
+          <w:ilvl w:val="1"/>
+          <w:numId w:val="1"/>
+        </w:numPr>
+        <w:rPr>
+          <w:b/>
+          <w:bCs/>
+          <w:sz w:val="28"/>
+          <w:szCs w:val="28"/>
+        </w:rPr>
+      </w:pPr>
+      <w:r>
+        <w:rPr>
+          <w:sz w:val="28"/>
+          <w:szCs w:val="28"/>
+        </w:rPr>
+        <w:t>AutoScroll chat</w:t>
+      </w:r>
+    </w:p>
+    <w:p>
+      <w:pPr>
+        <w:pStyle w:val="ListParagraph"/>
+        <w:numPr>
+          <w:ilvl w:val="1"/>
+          <w:numId w:val="1"/>
+        </w:numPr>
+        <w:rPr>
+          <w:b/>
+          <w:bCs/>
+          <w:sz w:val="28"/>
+          <w:szCs w:val="28"/>
+        </w:rPr>
+      </w:pPr>
+      <w:r>
+        <w:rPr>
+          <w:sz w:val="28"/>
+          <w:szCs w:val="28"/>
+        </w:rPr>
+        <w:t>ListBox selection</w:t>
+      </w:r>
+    </w:p>
+    <w:p>
+      <w:pPr>
+        <w:pStyle w:val="ListParagraph"/>
+        <w:numPr>
+          <w:ilvl w:val="1"/>
+          <w:numId w:val="1"/>
+        </w:numPr>
+        <w:rPr>
+          <w:b/>
+          <w:bCs/>
+          <w:sz w:val="28"/>
+          <w:szCs w:val="28"/>
+        </w:rPr>
+      </w:pPr>
+      <w:r>
+        <w:rPr>
+          <w:sz w:val="28"/>
+          <w:szCs w:val="28"/>
+        </w:rPr>
+        <w:t>ObservableCollection</w:t>
+      </w:r>
+    </w:p>
+    <w:p>
+      <w:pPr>
+        <w:pStyle w:val="ListParagraph"/>
+        <w:numPr>
+          <w:ilvl w:val="1"/>
+          <w:numId w:val="1"/>
+        </w:numPr>
+        <w:rPr>
+          <w:b/>
+          <w:bCs/>
+          <w:sz w:val="28"/>
+          <w:szCs w:val="28"/>
+        </w:rPr>
+      </w:pPr>
+      <w:r>
+        <w:rPr>
+          <w:sz w:val="28"/>
+          <w:szCs w:val="28"/>
+        </w:rPr>
+        <w:t>Master-detail UI</w:t>
+      </w:r>
+    </w:p>
+    <w:p>
+      <w:pPr>
+        <w:pStyle w:val="ListParagraph"/>
+        <w:numPr>
+          <w:ilvl w:val="3"/>
+          <w:numId w:val="1"/>
+        </w:numPr>
+        <w:rPr>
+          <w:b/>
+          <w:bCs/>
+          <w:sz w:val="28"/>
+          <w:szCs w:val="28"/>
+        </w:rPr>
+      </w:pPr>
+      <w:r>
+        <w:rPr>
+          <w:sz w:val="28"/>
+          <w:szCs w:val="28"/>
+        </w:rPr>
+        <w:t>Version 6 :-</w:t>
+      </w:r>
+    </w:p>
+    <w:p>
+      <w:pPr>
+        <w:pStyle w:val="ListParagraph"/>
+        <w:numPr>
+          <w:ilvl w:val="0"/>
+          <w:numId w:val="1"/>
+        </w:numPr>
+        <w:rPr>
+          <w:b/>
+          <w:bCs/>
+          <w:sz w:val="28"/>
+          <w:szCs w:val="28"/>
+        </w:rPr>
+      </w:pPr>
+      <w:r>
+        <w:rPr>
+          <w:sz w:val="28"/>
+          <w:szCs w:val="28"/>
+        </w:rPr>
+        <w:t>Auto Weather Refresh :-</w:t>
+      </w:r>
+    </w:p>
+    <w:p>
+      <w:pPr>
+        <w:pStyle w:val="ListParagraph"/>
+        <w:numPr>
+          <w:ilvl w:val="0"/>
+          <w:numId w:val="1"/>
+        </w:numPr>
+        <w:rPr>
+          <w:b/>
+          <w:bCs/>
+          <w:sz w:val="28"/>
+          <w:szCs w:val="28"/>
+        </w:rPr>
+      </w:pPr>
+      <w:r>
+        <w:rPr>
+          <w:sz w:val="28"/>
+          <w:szCs w:val="28"/>
+        </w:rPr>
+        <w:t>Learn</w:t>
+      </w:r>
+    </w:p>
+    <w:p>
+      <w:pPr>
+        <w:pStyle w:val="ListParagraph"/>
+        <w:numPr>
+          <w:ilvl w:val="1"/>
+          <w:numId w:val="1"/>
+        </w:numPr>
+        <w:rPr>
+          <w:b/>
+          <w:bCs/>
+          <w:sz w:val="28"/>
+          <w:szCs w:val="28"/>
+        </w:rPr>
+      </w:pPr>
+      <w:r>
+        <w:rPr>
+          <w:sz w:val="28"/>
+          <w:szCs w:val="28"/>
+        </w:rPr>
+        <w:t>Dispatcher Timer</w:t>
+      </w:r>
+    </w:p>
+    <w:p>
+      <w:pPr>
+        <w:pStyle w:val="ListParagraph"/>
+        <w:numPr>
+          <w:ilvl w:val="1"/>
+          <w:numId w:val="1"/>
+        </w:numPr>
+        <w:rPr>
+          <w:b/>
+          <w:bCs/>
+          <w:sz w:val="28"/>
+          <w:szCs w:val="28"/>
+        </w:rPr>
+      </w:pPr>
+      <w:r>
+        <w:rPr>
+          <w:sz w:val="28"/>
+          <w:szCs w:val="28"/>
+        </w:rPr>
+        <w:t>Background Tasks</w:t>
+      </w:r>
+    </w:p>
+    <w:p>
+      <w:pPr>
+        <w:pStyle w:val="ListParagraph"/>
+        <w:ind w:left="1440"/>
+        <w:rPr>
+          <w:b/>
+          <w:bCs/>
+          <w:sz w:val="28"/>
+          <w:szCs w:val="28"/>
+        </w:rPr>
+      </w:pPr>
+    </w:p>
+    <w:p>
+      <w:pPr>
+        <w:pStyle w:val="ListParagraph"/>
+        <w:numPr>
+          <w:ilvl w:val="3"/>
+          <w:numId w:val="1"/>
+        </w:numPr>
+        <w:rPr>
+          <w:b/>
+          <w:bCs/>
+          <w:sz w:val="28"/>
+          <w:szCs w:val="28"/>
+        </w:rPr>
+      </w:pPr>
+      <w:r>
+        <w:rPr>
+          <w:b/>
+          <w:bCs/>
+          <w:sz w:val="28"/>
+          <w:szCs w:val="28"/>
+        </w:rPr>
+        <w:t>Version 7 :-</w:t>
+      </w:r>
+      <w:r>
+        <w:rPr>
+          <w:b/>
+          <w:bCs/>
+          <w:sz w:val="28"/>
+          <w:szCs w:val="28"/>
+        </w:rPr>
+        <w:t xml:space="preserve"> Weather Charts</w:t>
+      </w:r>
+    </w:p>
+    <w:p>
+      <w:pPr>
+        <w:pStyle w:val="ListParagraph"/>
+        <w:numPr>
+          <w:ilvl w:val="0"/>
+          <w:numId w:val="1"/>
+        </w:numPr>
+        <w:rPr>
+          <w:b/>
+          <w:bCs/>
+          <w:sz w:val="28"/>
+          <w:szCs w:val="28"/>
+        </w:rPr>
+      </w:pPr>
+      <w:r>
+        <w:rPr>
+          <w:sz w:val="28"/>
+          <w:szCs w:val="28"/>
+        </w:rPr>
+        <w:t>Learn</w:t>
+      </w:r>
+    </w:p>
+    <w:p>
+      <w:pPr>
+        <w:pStyle w:val="ListParagraph"/>
+        <w:numPr>
+          <w:ilvl w:val="1"/>
+          <w:numId w:val="1"/>
+        </w:numPr>
+        <w:rPr>
+          <w:b/>
+          <w:bCs/>
+          <w:sz w:val="28"/>
+          <w:szCs w:val="28"/>
+        </w:rPr>
+      </w:pPr>
+      <w:r>
+        <w:rPr>
+          <w:sz w:val="28"/>
+          <w:szCs w:val="28"/>
+        </w:rPr>
+        <w:t>WPF Charts</w:t>
+      </w:r>
+    </w:p>
+    <w:p>
+      <w:pPr>
+        <w:pStyle w:val="ListParagraph"/>
+        <w:numPr>
+          <w:ilvl w:val="1"/>
+          <w:numId w:val="1"/>
+        </w:numPr>
+        <w:rPr>
+          <w:b/>
+          <w:bCs/>
+          <w:sz w:val="28"/>
+          <w:szCs w:val="28"/>
+        </w:rPr>
+      </w:pPr>
+      <w:r>
+        <w:rPr>
+          <w:sz w:val="28"/>
+          <w:szCs w:val="28"/>
+        </w:rPr>
+        <w:t>Data Visualization</w:t>
+      </w:r>
+    </w:p>
+    <w:p>
+      <w:pPr>
+        <w:pStyle w:val="ListParagraph"/>
+        <w:ind w:left="1440"/>
+        <w:rPr>
+          <w:b/>
+          <w:bCs/>
+          <w:sz w:val="28"/>
+          <w:szCs w:val="28"/>
+        </w:rPr>
+      </w:pPr>
+    </w:p>
+    <w:p>
+      <w:pPr>
+        <w:pStyle w:val="ListParagraph"/>
+        <w:numPr>
+          <w:ilvl w:val="3"/>
+          <w:numId w:val="1"/>
+        </w:numPr>
+        <w:rPr>
+          <w:b/>
+          <w:bCs/>
+          <w:sz w:val="28"/>
+          <w:szCs w:val="28"/>
+        </w:rPr>
+      </w:pPr>
+      <w:r>
+        <w:rPr>
+          <w:b/>
+          <w:bCs/>
+          <w:sz w:val="28"/>
+          <w:szCs w:val="28"/>
+        </w:rPr>
+        <w:t>Version 8 :-</w:t>
+      </w:r>
+      <w:r>
+        <w:rPr>
+          <w:b/>
+          <w:bCs/>
+          <w:sz w:val="28"/>
+          <w:szCs w:val="28"/>
+        </w:rPr>
+        <w:t xml:space="preserve"> Setting Page</w:t>
+      </w:r>
+    </w:p>
+    <w:p>
+      <w:pPr>
+        <w:pStyle w:val="ListParagraph"/>
+        <w:numPr>
+          <w:ilvl w:val="0"/>
+          <w:numId w:val="1"/>
+        </w:numPr>
+        <w:rPr>
+          <w:b/>
+          <w:bCs/>
+          <w:sz w:val="28"/>
+          <w:szCs w:val="28"/>
+        </w:rPr>
+      </w:pPr>
+      <w:r>
+        <w:rPr>
+          <w:sz w:val="28"/>
+          <w:szCs w:val="28"/>
+        </w:rPr>
+        <w:t>Learn</w:t>
+      </w:r>
+    </w:p>
+    <w:p>
+      <w:pPr>
+        <w:pStyle w:val="ListParagraph"/>
+        <w:numPr>
+          <w:ilvl w:val="1"/>
+          <w:numId w:val="1"/>
+        </w:numPr>
+        <w:rPr>
+          <w:b/>
+          <w:bCs/>
+          <w:sz w:val="28"/>
+          <w:szCs w:val="28"/>
+        </w:rPr>
+      </w:pPr>
+      <w:r>
+        <w:rPr>
+          <w:sz w:val="28"/>
+          <w:szCs w:val="28"/>
+        </w:rPr>
+        <w:t>Configuration Files</w:t>
+      </w:r>
+    </w:p>
+    <w:p>
+      <w:pPr>
+        <w:pStyle w:val="ListParagraph"/>
+        <w:numPr>
+          <w:ilvl w:val="1"/>
+          <w:numId w:val="1"/>
+        </w:numPr>
+        <w:rPr>
+          <w:b/>
+          <w:bCs/>
+          <w:sz w:val="28"/>
+          <w:szCs w:val="28"/>
+        </w:rPr>
+      </w:pPr>
+      <w:r>
+        <w:rPr>
+          <w:sz w:val="28"/>
+          <w:szCs w:val="28"/>
+        </w:rPr>
+        <w:t xml:space="preserve">Navigation </w:t>
+      </w:r>
+    </w:p>
+    <w:p>
+      <w:pPr>
+        <w:pStyle w:val="ListParagraph"/>
+        <w:numPr>
+          <w:ilvl w:val="1"/>
+          <w:numId w:val="1"/>
+        </w:numPr>
+        <w:rPr>
+          <w:b/>
+          <w:bCs/>
+          <w:sz w:val="28"/>
+          <w:szCs w:val="28"/>
+        </w:rPr>
+      </w:pPr>
+      <w:r>
+        <w:rPr>
+          <w:sz w:val="28"/>
+          <w:szCs w:val="28"/>
+        </w:rPr>
+        <w:t>User preferences</w:t>
+      </w:r>
+    </w:p>
+    <w:p>
+      <w:pPr>
+        <w:pStyle w:val="ListParagraph"/>
+        <w:ind w:left="1440"/>
+        <w:rPr>
+          <w:b/>
+          <w:bCs/>
+          <w:sz w:val="28"/>
+          <w:szCs w:val="28"/>
+        </w:rPr>
+      </w:pPr>
+    </w:p>
+    <w:p>
+      <w:pPr>
+        <w:pStyle w:val="ListParagraph"/>
+        <w:numPr>
+          <w:ilvl w:val="3"/>
+          <w:numId w:val="1"/>
+        </w:numPr>
+        <w:rPr>
+          <w:b/>
+          <w:bCs/>
+          <w:sz w:val="28"/>
+          <w:szCs w:val="28"/>
+        </w:rPr>
+      </w:pPr>
+      <w:r>
+        <w:rPr>
+          <w:b/>
+          <w:bCs/>
+          <w:sz w:val="28"/>
+          <w:szCs w:val="28"/>
+        </w:rPr>
+        <w:t>Version 9 :-</w:t>
+      </w:r>
+      <w:r>
+        <w:rPr>
+          <w:b/>
+          <w:bCs/>
+          <w:sz w:val="28"/>
+          <w:szCs w:val="28"/>
+        </w:rPr>
+        <w:t xml:space="preserve"> Database</w:t>
+      </w:r>
+    </w:p>
+    <w:p>
+      <w:pPr>
+        <w:pStyle w:val="ListParagraph"/>
+        <w:numPr>
+          <w:ilvl w:val="0"/>
+          <w:numId w:val="1"/>
+        </w:numPr>
+        <w:rPr>
+          <w:b/>
+          <w:bCs/>
+          <w:sz w:val="28"/>
+          <w:szCs w:val="28"/>
+        </w:rPr>
+      </w:pPr>
+      <w:r>
+        <w:rPr>
+          <w:sz w:val="28"/>
+          <w:szCs w:val="28"/>
+        </w:rPr>
+        <w:t>Store Chats permanently</w:t>
+      </w:r>
+    </w:p>
+    <w:p>
+      <w:pPr>
+        <w:pStyle w:val="ListParagraph"/>
+        <w:numPr>
+          <w:ilvl w:val="0"/>
+          <w:numId w:val="1"/>
+        </w:numPr>
+        <w:rPr>
+          <w:b/>
+          <w:bCs/>
+          <w:sz w:val="28"/>
+          <w:szCs w:val="28"/>
+        </w:rPr>
+      </w:pPr>
+      <w:r>
+        <w:rPr>
+          <w:sz w:val="28"/>
+          <w:szCs w:val="28"/>
+        </w:rPr>
+        <w:t xml:space="preserve">Learn </w:t>
+      </w:r>
+    </w:p>
+    <w:p>
+      <w:pPr>
+        <w:pStyle w:val="ListParagraph"/>
+        <w:numPr>
+          <w:ilvl w:val="1"/>
+          <w:numId w:val="1"/>
+        </w:numPr>
+        <w:rPr>
+          <w:b/>
+          <w:bCs/>
+          <w:sz w:val="28"/>
+          <w:szCs w:val="28"/>
+        </w:rPr>
+      </w:pPr>
+      <w:r>
+        <w:rPr>
+          <w:sz w:val="28"/>
+          <w:szCs w:val="28"/>
+        </w:rPr>
+        <w:t>SQLite</w:t>
+      </w:r>
+    </w:p>
+    <w:p>
+      <w:pPr>
+        <w:pStyle w:val="ListParagraph"/>
+        <w:numPr>
+          <w:ilvl w:val="1"/>
+          <w:numId w:val="1"/>
+        </w:numPr>
+        <w:rPr>
+          <w:b/>
+          <w:bCs/>
+          <w:sz w:val="28"/>
+          <w:szCs w:val="28"/>
+        </w:rPr>
+      </w:pPr>
+      <w:r>
+        <w:rPr>
+          <w:sz w:val="28"/>
+          <w:szCs w:val="28"/>
+        </w:rPr>
+        <w:t>Entity Framework Work</w:t>
+      </w:r>
+    </w:p>
+    <w:p>
+      <w:pPr>
+        <w:pStyle w:val="ListParagraph"/>
+        <w:numPr>
+          <w:ilvl w:val="1"/>
+          <w:numId w:val="1"/>
+        </w:numPr>
+        <w:rPr>
+          <w:b/>
+          <w:bCs/>
+          <w:sz w:val="28"/>
+          <w:szCs w:val="28"/>
+        </w:rPr>
+      </w:pPr>
+      <w:r>
+        <w:rPr>
+          <w:sz w:val="28"/>
+          <w:szCs w:val="28"/>
+        </w:rPr>
+        <w:t>Very valuable for .NET jobs</w:t>
+      </w:r>
+    </w:p>
+    <w:p>
+      <w:pPr>
+        <w:pStyle w:val="ListParagraph"/>
+        <w:numPr>
+          <w:ilvl w:val="3"/>
+          <w:numId w:val="1"/>
+        </w:numPr>
+        <w:rPr>
+          <w:b/>
+          <w:bCs/>
+          <w:sz w:val="28"/>
+          <w:szCs w:val="28"/>
+        </w:rPr>
+      </w:pPr>
+      <w:r>
+        <w:rPr>
+          <w:sz w:val="28"/>
+          <w:szCs w:val="28"/>
+        </w:rPr>
+        <w:t>Version 10 :-</w:t>
+      </w:r>
+    </w:p>
+    <w:p>
+      <w:pPr>
+        <w:pStyle w:val="ListParagraph"/>
+        <w:numPr>
+          <w:ilvl w:val="0"/>
+          <w:numId w:val="1"/>
+        </w:numPr>
+        <w:rPr>
+          <w:b/>
+          <w:bCs/>
+          <w:sz w:val="28"/>
+          <w:szCs w:val="28"/>
+        </w:rPr>
+      </w:pPr>
+      <w:r>
+        <w:rPr>
+          <w:sz w:val="28"/>
+          <w:szCs w:val="28"/>
+        </w:rPr>
+        <w:t>Choose</w:t>
+      </w:r>
+    </w:p>
+    <w:p>
+      <w:pPr>
+        <w:pStyle w:val="ListParagraph"/>
+        <w:numPr>
+          <w:ilvl w:val="1"/>
+          <w:numId w:val="1"/>
+        </w:numPr>
+        <w:rPr>
+          <w:b/>
+          <w:bCs/>
+          <w:sz w:val="28"/>
+          <w:szCs w:val="28"/>
+        </w:rPr>
+      </w:pPr>
+      <w:r>
+        <w:rPr>
+          <w:sz w:val="28"/>
+          <w:szCs w:val="28"/>
+        </w:rPr>
+        <w:t>Llama3</w:t>
+      </w:r>
+    </w:p>
+    <w:p>
+      <w:pPr>
+        <w:pStyle w:val="ListParagraph"/>
+        <w:numPr>
+          <w:ilvl w:val="1"/>
+          <w:numId w:val="1"/>
+        </w:numPr>
+        <w:rPr>
+          <w:b/>
+          <w:bCs/>
+          <w:sz w:val="28"/>
+          <w:szCs w:val="28"/>
+        </w:rPr>
+      </w:pPr>
+      <w:r>
+        <w:rPr>
+          <w:sz w:val="28"/>
+          <w:szCs w:val="28"/>
+        </w:rPr>
+        <w:t>Mistral</w:t>
+      </w:r>
+    </w:p>
+    <w:p>
+      <w:pPr>
+        <w:pStyle w:val="ListParagraph"/>
+        <w:numPr>
+          <w:ilvl w:val="1"/>
+          <w:numId w:val="1"/>
+        </w:numPr>
+        <w:rPr>
+          <w:b/>
+          <w:bCs/>
+          <w:sz w:val="28"/>
+          <w:szCs w:val="28"/>
+        </w:rPr>
+      </w:pPr>
+      <w:r>
+        <w:rPr>
+          <w:sz w:val="28"/>
+          <w:szCs w:val="28"/>
+        </w:rPr>
+        <w:t>Gemma</w:t>
+      </w:r>
+    </w:p>
+    <w:p>
+      <w:pPr>
+        <w:pStyle w:val="ListParagraph"/>
+        <w:numPr>
+          <w:ilvl w:val="0"/>
+          <w:numId w:val="1"/>
+        </w:numPr>
+        <w:rPr>
+          <w:b/>
+          <w:bCs/>
+          <w:sz w:val="28"/>
+          <w:szCs w:val="28"/>
+        </w:rPr>
+      </w:pPr>
+      <w:r>
+        <w:rPr>
+          <w:sz w:val="28"/>
+          <w:szCs w:val="28"/>
+        </w:rPr>
+        <w:t>Learn</w:t>
+      </w:r>
+    </w:p>
+    <w:p>
+      <w:pPr>
+        <w:pStyle w:val="ListParagraph"/>
+        <w:numPr>
+          <w:ilvl w:val="1"/>
+          <w:numId w:val="1"/>
+        </w:numPr>
+        <w:rPr>
+          <w:b/>
+          <w:bCs/>
+          <w:sz w:val="28"/>
+          <w:szCs w:val="28"/>
+        </w:rPr>
+      </w:pPr>
+      <w:r>
+        <w:rPr>
+          <w:sz w:val="28"/>
+          <w:szCs w:val="28"/>
+        </w:rPr>
+        <w:t>API abstraction</w:t>
+      </w:r>
+    </w:p>
+    <w:p>
+      <w:pPr>
+        <w:pStyle w:val="ListParagraph"/>
+        <w:numPr>
+          <w:ilvl w:val="1"/>
+          <w:numId w:val="1"/>
+        </w:numPr>
+        <w:rPr>
+          <w:b/>
+          <w:bCs/>
+          <w:sz w:val="28"/>
+          <w:szCs w:val="28"/>
+        </w:rPr>
+      </w:pPr>
+      <w:r>
+        <w:rPr>
+          <w:sz w:val="28"/>
+          <w:szCs w:val="28"/>
+        </w:rPr>
+        <w:t>Strategy pattern</w:t>
+      </w:r>
+    </w:p>
+    <w:p>
+      <w:pPr>
+        <w:pStyle w:val="ListParagraph"/>
+        <w:ind w:left="1440"/>
+        <w:rPr>
+          <w:b/>
+          <w:bCs/>
+          <w:sz w:val="28"/>
+          <w:szCs w:val="28"/>
+        </w:rPr>
+      </w:pPr>
+    </w:p>
+    <w:p>
+      <w:pPr>
+        <w:pStyle w:val="ListParagraph"/>
+        <w:numPr>
+          <w:ilvl w:val="3"/>
+          <w:numId w:val="1"/>
+        </w:numPr>
+        <w:rPr>
+          <w:b/>
+          <w:bCs/>
+          <w:sz w:val="28"/>
+          <w:szCs w:val="28"/>
+        </w:rPr>
+      </w:pPr>
+      <w:r>
+        <w:rPr>
+          <w:b/>
+          <w:bCs/>
+          <w:sz w:val="28"/>
+          <w:szCs w:val="28"/>
+        </w:rPr>
+        <w:t>Version 11 :-</w:t>
+      </w:r>
+      <w:r>
+        <w:rPr>
+          <w:b/>
+          <w:bCs/>
+          <w:sz w:val="28"/>
+          <w:szCs w:val="28"/>
+        </w:rPr>
+        <w:t xml:space="preserve"> Export chat</w:t>
+      </w:r>
+    </w:p>
+    <w:p>
+      <w:pPr>
+        <w:pStyle w:val="ListParagraph"/>
+        <w:numPr>
+          <w:ilvl w:val="0"/>
+          <w:numId w:val="1"/>
+        </w:numPr>
+        <w:rPr>
+          <w:b/>
+          <w:bCs/>
+          <w:sz w:val="28"/>
+          <w:szCs w:val="28"/>
+        </w:rPr>
+      </w:pPr>
+      <w:r>
+        <w:rPr>
+          <w:sz w:val="28"/>
+          <w:szCs w:val="28"/>
+        </w:rPr>
+        <w:t>Export to :-</w:t>
+      </w:r>
+    </w:p>
+    <w:p>
+      <w:pPr>
+        <w:pStyle w:val="ListParagraph"/>
+        <w:numPr>
+          <w:ilvl w:val="1"/>
+          <w:numId w:val="1"/>
+        </w:numPr>
+        <w:rPr>
+          <w:b/>
+          <w:bCs/>
+          <w:sz w:val="28"/>
+          <w:szCs w:val="28"/>
+        </w:rPr>
+      </w:pPr>
+      <w:r>
+        <w:rPr>
+          <w:sz w:val="28"/>
+          <w:szCs w:val="28"/>
+        </w:rPr>
+        <w:t>PDF</w:t>
+      </w:r>
+    </w:p>
+    <w:p>
+      <w:pPr>
+        <w:pStyle w:val="ListParagraph"/>
+        <w:numPr>
+          <w:ilvl w:val="1"/>
+          <w:numId w:val="1"/>
+        </w:numPr>
+        <w:rPr>
+          <w:b/>
+          <w:bCs/>
+          <w:sz w:val="28"/>
+          <w:szCs w:val="28"/>
+        </w:rPr>
+      </w:pPr>
+      <w:r>
+        <w:rPr>
+          <w:sz w:val="28"/>
+          <w:szCs w:val="28"/>
+        </w:rPr>
+        <w:t>TXT</w:t>
+      </w:r>
+    </w:p>
+    <w:p>
+      <w:pPr>
+        <w:pStyle w:val="ListParagraph"/>
+        <w:numPr>
+          <w:ilvl w:val="1"/>
+          <w:numId w:val="1"/>
+        </w:numPr>
+        <w:rPr>
+          <w:b/>
+          <w:bCs/>
+          <w:sz w:val="28"/>
+          <w:szCs w:val="28"/>
+        </w:rPr>
+      </w:pPr>
+      <w:r>
+        <w:rPr>
+          <w:sz w:val="28"/>
+          <w:szCs w:val="28"/>
+        </w:rPr>
+        <w:t>DOCX</w:t>
+      </w:r>
+    </w:p>
+    <w:p>
+      <w:pPr>
+        <w:pStyle w:val="ListParagraph"/>
+        <w:numPr>
+          <w:ilvl w:val="0"/>
+          <w:numId w:val="1"/>
+        </w:numPr>
+        <w:rPr>
+          <w:b/>
+          <w:bCs/>
+          <w:sz w:val="28"/>
+          <w:szCs w:val="28"/>
+        </w:rPr>
+      </w:pPr>
+      <w:r>
+        <w:rPr>
+          <w:sz w:val="28"/>
+          <w:szCs w:val="28"/>
+        </w:rPr>
+        <w:t>Learn</w:t>
+      </w:r>
+    </w:p>
+    <w:p>
+      <w:pPr>
+        <w:pStyle w:val="ListParagraph"/>
+        <w:numPr>
+          <w:ilvl w:val="1"/>
+          <w:numId w:val="1"/>
+        </w:numPr>
+        <w:rPr>
+          <w:b/>
+          <w:bCs/>
+          <w:sz w:val="28"/>
+          <w:szCs w:val="28"/>
+        </w:rPr>
+      </w:pPr>
+      <w:r>
+        <w:rPr>
+          <w:sz w:val="28"/>
+          <w:szCs w:val="28"/>
+        </w:rPr>
+        <w:t>File handling</w:t>
+      </w:r>
+    </w:p>
+    <w:p>
+      <w:pPr>
+        <w:pStyle w:val="ListParagraph"/>
+        <w:numPr>
+          <w:ilvl w:val="1"/>
+          <w:numId w:val="1"/>
+        </w:numPr>
+        <w:rPr>
+          <w:b/>
+          <w:bCs/>
+          <w:sz w:val="28"/>
+          <w:szCs w:val="28"/>
+        </w:rPr>
+      </w:pPr>
+      <w:r>
+        <w:rPr>
+          <w:sz w:val="28"/>
+          <w:szCs w:val="28"/>
+        </w:rPr>
+        <w:t>Reports</w:t>
+      </w:r>
+    </w:p>
+    <w:p>
+      <w:pPr>
+        <w:pStyle w:val="ListParagraph"/>
+        <w:ind w:left="1440"/>
+        <w:rPr>
+          <w:b/>
+          <w:bCs/>
+          <w:sz w:val="28"/>
+          <w:szCs w:val="28"/>
+        </w:rPr>
+      </w:pPr>
+    </w:p>
+    <w:p>
+      <w:pPr>
+        <w:pStyle w:val="ListParagraph"/>
+        <w:numPr>
+          <w:ilvl w:val="3"/>
+          <w:numId w:val="1"/>
+        </w:numPr>
+        <w:rPr>
+          <w:b/>
+          <w:bCs/>
+          <w:sz w:val="28"/>
+          <w:szCs w:val="28"/>
+        </w:rPr>
+      </w:pPr>
+      <w:r>
+        <w:rPr>
+          <w:b/>
+          <w:bCs/>
+          <w:sz w:val="28"/>
+          <w:szCs w:val="28"/>
+        </w:rPr>
+        <w:t>Version 12 – Navigation + MainViewModel</w:t>
+      </w:r>
+    </w:p>
     <w:p/>
     <w:sectPr>
       <w:pgSz w:w="11910" w:h="16840"/>
@@ -356,6 +1645,127 @@
     </w:sectPr>
   </w:body>
 </w:document>
+</file>
+
+<file path=word/numbering.xml><?xml version="1.0" encoding="utf-8"?>
+<w:numbering xmlns:wpc="http://schemas.microsoft.com/office/word/2010/wordprocessingCanvas" xmlns:cx="http://schemas.microsoft.com/office/drawing/2014/chartex" xmlns:cx1="http://schemas.microsoft.com/office/drawing/2015/9/8/chartex" xmlns:cx2="http://schemas.microsoft.com/office/drawing/2015/10/21/chartex" xmlns:cx3="http://schemas.microsoft.com/office/drawing/2016/5/9/chartex" xmlns:cx4="http://schemas.microsoft.com/office/drawing/2016/5/10/chartex" xmlns:cx5="http://schemas.microsoft.com/office/drawing/2016/5/11/chartex" xmlns:cx6="http://schemas.microsoft.com/office/drawing/2016/5/12/chartex" xmlns:cx7="http://schemas.microsoft.com/office/drawing/2016/5/13/chartex" xmlns:cx8="http://schemas.microsoft.com/office/drawing/2016/5/14/chartex" xmlns:mc="http://schemas.openxmlformats.org/markup-compatibility/2006" xmlns:aink="http://schemas.microsoft.com/office/drawing/2016/ink" xmlns:am3d="http://schemas.microsoft.com/office/drawing/2017/model3d" xmlns:o="urn:schemas-microsoft-com:office:office" xmlns:oel="http://schemas.microsoft.com/office/2019/extlst" xmlns:r="http://schemas.openxmlformats.org/officeDocument/2006/relationships" xmlns:m="http://schemas.openxmlformats.org/officeDocument/2006/math" xmlns:v="urn:schemas-microsoft-com:vml" xmlns:wp14="http://schemas.microsoft.com/office/word/2010/wordprocessingDrawing" xmlns:wp="http://schemas.openxmlformats.org/drawingml/2006/wordprocessingDrawing" xmlns:w10="urn:schemas-microsoft-com:office:word" xmlns:w="http://schemas.openxmlformats.org/wordprocessingml/2006/main" xmlns:w14="http://schemas.microsoft.com/office/word/2010/wordml" xmlns:w15="http://schemas.microsoft.com/office/word/2012/wordml" xmlns:w16cex="http://schemas.microsoft.com/office/word/2018/wordml/cex" xmlns:w16cid="http://schemas.microsoft.com/office/word/2016/wordml/cid" xmlns:w16="http://schemas.microsoft.com/office/word/2018/wordml" xmlns:w16du="http://schemas.microsoft.com/office/word/2023/wordml/word16du" xmlns:w16sdtdh="http://schemas.microsoft.com/office/word/2020/wordml/sdtdatahash" xmlns:w16sdtfl="http://schemas.microsoft.com/office/word/2024/wordml/sdtformatlock" xmlns:w16se="http://schemas.microsoft.com/office/word/2015/wordml/symex" xmlns:wpg="http://schemas.microsoft.com/office/word/2010/wordprocessingGroup" xmlns:wpi="http://schemas.microsoft.com/office/word/2010/wordprocessingInk" xmlns:wne="http://schemas.microsoft.com/office/word/2006/wordml" xmlns:wps="http://schemas.microsoft.com/office/word/2010/wordprocessingShape" mc:Ignorable="w14 w15 w16se w16cid w16 w16cex w16sdtdh w16sdtfl w16du wp14">
+  <w:abstractNum w:abstractNumId="0" w15:restartNumberingAfterBreak="0">
+    <w:nsid w:val="32F80735"/>
+    <w:multiLevelType w:val="hybridMultilevel"/>
+    <w:tmpl w:val="8DA805E4"/>
+    <w:lvl w:ilvl="0" w:tplc="40090001">
+      <w:start w:val="1"/>
+      <w:numFmt w:val="bullet"/>
+      <w:lvlText w:val=""/>
+      <w:lvlJc w:val="left"/>
+      <w:pPr>
+        <w:ind w:left="720" w:hanging="360"/>
+      </w:pPr>
+      <w:rPr>
+        <w:rFonts w:ascii="Symbol" w:hAnsi="Symbol" w:hint="default"/>
+      </w:rPr>
+    </w:lvl>
+    <w:lvl w:ilvl="1" w:tplc="40090003">
+      <w:start w:val="1"/>
+      <w:numFmt w:val="bullet"/>
+      <w:lvlText w:val="o"/>
+      <w:lvlJc w:val="left"/>
+      <w:pPr>
+        <w:ind w:left="1440" w:hanging="360"/>
+      </w:pPr>
+      <w:rPr>
+        <w:rFonts w:ascii="Courier New" w:hAnsi="Courier New" w:cs="Courier New" w:hint="default"/>
+      </w:rPr>
+    </w:lvl>
+    <w:lvl w:ilvl="2" w:tplc="40090005">
+      <w:start w:val="1"/>
+      <w:numFmt w:val="bullet"/>
+      <w:lvlText w:val=""/>
+      <w:lvlJc w:val="left"/>
+      <w:pPr>
+        <w:ind w:left="2160" w:hanging="360"/>
+      </w:pPr>
+      <w:rPr>
+        <w:rFonts w:ascii="Wingdings" w:hAnsi="Wingdings" w:hint="default"/>
+      </w:rPr>
+    </w:lvl>
+    <w:lvl w:ilvl="3" w:tplc="40090001">
+      <w:start w:val="1"/>
+      <w:numFmt w:val="bullet"/>
+      <w:lvlText w:val=""/>
+      <w:lvlJc w:val="left"/>
+      <w:pPr>
+        <w:ind w:left="2880" w:hanging="360"/>
+      </w:pPr>
+      <w:rPr>
+        <w:rFonts w:ascii="Symbol" w:hAnsi="Symbol" w:hint="default"/>
+      </w:rPr>
+    </w:lvl>
+    <w:lvl w:ilvl="4" w:tplc="40090003">
+      <w:start w:val="1"/>
+      <w:numFmt w:val="bullet"/>
+      <w:lvlText w:val="o"/>
+      <w:lvlJc w:val="left"/>
+      <w:pPr>
+        <w:ind w:left="3600" w:hanging="360"/>
+      </w:pPr>
+      <w:rPr>
+        <w:rFonts w:ascii="Courier New" w:hAnsi="Courier New" w:cs="Courier New" w:hint="default"/>
+      </w:rPr>
+    </w:lvl>
+    <w:lvl w:ilvl="5" w:tplc="40090005">
+      <w:start w:val="1"/>
+      <w:numFmt w:val="bullet"/>
+      <w:lvlText w:val=""/>
+      <w:lvlJc w:val="left"/>
+      <w:pPr>
+        <w:ind w:left="4320" w:hanging="360"/>
+      </w:pPr>
+      <w:rPr>
+        <w:rFonts w:ascii="Wingdings" w:hAnsi="Wingdings" w:hint="default"/>
+      </w:rPr>
+    </w:lvl>
+    <w:lvl w:ilvl="6" w:tplc="40090001">
+      <w:start w:val="1"/>
+      <w:numFmt w:val="bullet"/>
+      <w:lvlText w:val=""/>
+      <w:lvlJc w:val="left"/>
+      <w:pPr>
+        <w:ind w:left="5040" w:hanging="360"/>
+      </w:pPr>
+      <w:rPr>
+        <w:rFonts w:ascii="Symbol" w:hAnsi="Symbol" w:hint="default"/>
+      </w:rPr>
+    </w:lvl>
+    <w:lvl w:ilvl="7" w:tplc="40090003" w:tentative="1">
+      <w:start w:val="1"/>
+      <w:numFmt w:val="bullet"/>
+      <w:lvlText w:val="o"/>
+      <w:lvlJc w:val="left"/>
+      <w:pPr>
+        <w:ind w:left="5760" w:hanging="360"/>
+      </w:pPr>
+      <w:rPr>
+        <w:rFonts w:ascii="Courier New" w:hAnsi="Courier New" w:cs="Courier New" w:hint="default"/>
+      </w:rPr>
+    </w:lvl>
+    <w:lvl w:ilvl="8" w:tplc="40090005" w:tentative="1">
+      <w:start w:val="1"/>
+      <w:numFmt w:val="bullet"/>
+      <w:lvlText w:val=""/>
+      <w:lvlJc w:val="left"/>
+      <w:pPr>
+        <w:ind w:left="6480" w:hanging="360"/>
+      </w:pPr>
+      <w:rPr>
+        <w:rFonts w:ascii="Wingdings" w:hAnsi="Wingdings" w:hint="default"/>
+      </w:rPr>
+    </w:lvl>
+  </w:abstractNum>
+  <w:num w:numId="1" w16cid:durableId="2139641579">
+    <w:abstractNumId w:val="0"/>
+  </w:num>
+</w:numbering>
 </file>
 
 <file path=word/styles.xml><?xml version="1.0" encoding="utf-8"?>
@@ -1275,6 +2685,25 @@
       <w:spacing w:val="5"/>
     </w:rPr>
   </w:style>
+  <w:style w:type="table" w:styleId="TableGrid">
+    <w:name w:val="Table Grid"/>
+    <w:basedOn w:val="TableNormal"/>
+    <w:uiPriority w:val="39"/>
+    <w:rsid w:val="00BF0530"/>
+    <w:pPr>
+      <w:spacing w:after="0" w:line="240" w:lineRule="auto"/>
+    </w:pPr>
+    <w:tblPr>
+      <w:tblBorders>
+        <w:top w:val="single" w:sz="4" w:space="0" w:color="auto"/>
+        <w:left w:val="single" w:sz="4" w:space="0" w:color="auto"/>
+        <w:bottom w:val="single" w:sz="4" w:space="0" w:color="auto"/>
+        <w:right w:val="single" w:sz="4" w:space="0" w:color="auto"/>
+        <w:insideH w:val="single" w:sz="4" w:space="0" w:color="auto"/>
+        <w:insideV w:val="single" w:sz="4" w:space="0" w:color="auto"/>
+      </w:tblBorders>
+    </w:tblPr>
+  </w:style>
 </w:styles>
 </file>
 

</xml_diff>